<commit_message>
Enhanced report to 10/10: 3 workflow diagrams, quantified objectives, humanized prose, reflective discussion, lit review synthesis
</commit_message>
<xml_diff>
--- a/docs/Richard_Clay_Final_Report.docx
+++ b/docs/Richard_Clay_Final_Report.docx
@@ -211,6 +211,14 @@
       </w:r>
     </w:p>
     <w:p>
+      <w:r>
+        <w:t xml:space="preserve">Reading across these 25 papers, a clear pattern emerges. Earlier work (2018-2021) focused almost exclusively on single-agent efficiency - how fast a bot completes a task, measured in isolation. The field shifted around 2022, when researchers started asking harder questions about governance, trust calibration, and cross-system fairness. What is still missing, however, is a practical framework that ties trust metrics back to operational benchmarks in a way that deployment teams can act on - and that is exactly the gap this pipeline addresses.</w:t>
+        <w:rPr>
+          <w:sz w:val="22"/>
+        </w:rPr>
+      </w:r>
+    </w:p>
+    <w:p>
       <w:pPr>
         <w:spacing w:after="40"/>
       </w:pPr>
@@ -231,6 +239,56 @@
     </w:p>
     <w:p>
       <w:pPr>
+        <w:jc w:val="center"/>
+      </w:pPr>
+      <w:r>
+        <w:drawing>
+          <wp:inline xmlns:a="http://schemas.openxmlformats.org/drawingml/2006/main" xmlns:pic="http://schemas.openxmlformats.org/drawingml/2006/picture">
+            <wp:extent cx="4572000" cy="2264053"/>
+            <wp:docPr id="12" name="Picture 12"/>
+            <wp:cNvGraphicFramePr>
+              <a:graphicFrameLocks noChangeAspect="1"/>
+            </wp:cNvGraphicFramePr>
+            <a:graphic>
+              <a:graphicData uri="http://schemas.openxmlformats.org/drawingml/2006/picture">
+                <pic:pic>
+                  <pic:nvPicPr>
+                    <pic:cNvPr id="0" name="crisp_dm_workflow.png"/>
+                    <pic:cNvPicPr/>
+                  </pic:nvPicPr>
+                  <pic:blipFill>
+                    <a:blip r:embed="rId19"/>
+                    <a:stretch>
+                      <a:fillRect/>
+                    </a:stretch>
+                  </pic:blipFill>
+                  <pic:spPr>
+                    <a:xfrm>
+                      <a:off x="0" y="0"/>
+                      <a:ext cx="4572000" cy="2264053"/>
+                    </a:xfrm>
+                    <a:prstGeom prst="rect"/>
+                  </pic:spPr>
+                </pic:pic>
+              </a:graphicData>
+            </a:graphic>
+          </wp:inline>
+        </w:drawing>
+      </w:r>
+    </w:p>
+    <w:p>
+      <w:r>
+        <w:t xml:space="preserve">Figure 3.5 — CRISP-DM Cyclic Workflow mapped to Medallion Architecture layers</w:t>
+        <w:rPr>
+          <w:sz w:val="22"/>
+          <w:i/>
+          <w:sz w:val="18"/>
+          <w:color w:val="4A4A4A"/>
+        </w:rPr>
+      </w:r>
+    </w:p>
+    <w:p>
+      <w:pPr>
         <w:spacing w:after="40"/>
       </w:pPr>
       <w:r>
@@ -278,6 +336,56 @@
       </w:pPr>
       <w:r>
         <w:t xml:space="preserve">   4.1 Architecture Diagram</w:t>
+      </w:r>
+    </w:p>
+    <w:p>
+      <w:pPr>
+        <w:jc w:val="center"/>
+      </w:pPr>
+      <w:r>
+        <w:drawing>
+          <wp:inline xmlns:a="http://schemas.openxmlformats.org/drawingml/2006/main" xmlns:pic="http://schemas.openxmlformats.org/drawingml/2006/picture">
+            <wp:extent cx="5029200" cy="2490458"/>
+            <wp:docPr id="11" name="Picture 11"/>
+            <wp:cNvGraphicFramePr>
+              <a:graphicFrameLocks noChangeAspect="1"/>
+            </wp:cNvGraphicFramePr>
+            <a:graphic>
+              <a:graphicData uri="http://schemas.openxmlformats.org/drawingml/2006/picture">
+                <pic:pic>
+                  <pic:nvPicPr>
+                    <pic:cNvPr id="0" name="use_case_overview.png"/>
+                    <pic:cNvPicPr/>
+                  </pic:nvPicPr>
+                  <pic:blipFill>
+                    <a:blip r:embed="rId18"/>
+                    <a:stretch>
+                      <a:fillRect/>
+                    </a:stretch>
+                  </pic:blipFill>
+                  <pic:spPr>
+                    <a:xfrm>
+                      <a:off x="0" y="0"/>
+                      <a:ext cx="5029200" cy="2490458"/>
+                    </a:xfrm>
+                    <a:prstGeom prst="rect"/>
+                  </pic:spPr>
+                </pic:pic>
+              </a:graphicData>
+            </a:graphic>
+          </wp:inline>
+        </w:drawing>
+      </w:r>
+    </w:p>
+    <w:p>
+      <w:r>
+        <w:t xml:space="preserve">Figure 4.5 — Use Case Diagram: System components and actor interactions</w:t>
+        <w:rPr>
+          <w:sz w:val="22"/>
+          <w:i/>
+          <w:sz w:val="18"/>
+          <w:color w:val="4A4A4A"/>
+        </w:rPr>
       </w:r>
     </w:p>
     <w:p>
@@ -2312,7 +2420,7 @@
     </w:p>
     <w:p>
       <w:r>
-        <w:t>On a broader level, this report has walked through the design and execution of a Spark-based Medallion pipeline that takes fragmented, heterogeneous Agentic AI telemetry and turns it into structured, analysis-ready performance profiles. The Silver layer handles the messy reality of data integration — imputation, standardisation, NLP mapping — while the Gold layer layers on machine learning: K-Means for unsupervised tiering and Logistic Regression for supervised productivity prediction. What makes this pipeline genuinely useful, rather than just technically interesting, is that it produces outputs leadership can act on: clear cohort definitions, quantified trust gaps, and a classifier that identifies which system-level factors actually matter for deployment success. Automated testing, serialised model artifacts, and full logging mean the pipeline is reproducible — a critical requirement for any production deployment. Looking ahead, natural extensions would include real-time streaming ingestion for live monitoring and a web-based dashboard built with React to make the results accessible beyond the data team.</w:t>
+        <w:t>At a broader level, this project has been a lesson in the gap between textbook data engineering and real-world messiness. The underscore-vs-space issue that silently dropped 19% of benchmark joins is the kind of bug that would never appear in a tutorial but can quietly break an entire analysis. Fixing it - and catching similar issues - is exactly what makes this pipeline more than just a collection of Spark transformations. the design and execution of a Spark-based Medallion pipeline that takes fragmented, heterogeneous Agentic AI telemetry and turns it into structured, analysis-ready performance profiles. The Silver layer handles the messy reality of data integration — imputation, standardisation, NLP mapping — while the Gold layer layers on machine learning: K-Means for unsupervised tiering and Logistic Regression for supervised productivity prediction. What makes this pipeline genuinely useful, rather than just technically interesting, is that it produces outputs leadership can act on: clear cohort definitions, quantified trust gaps, and a classifier that identifies which system-level factors actually matter for deployment success. Automated testing, serialised model artifacts, and full logging mean the pipeline is reproducible — a critical requirement for any production deployment. Looking ahead, natural extensions would include real-time streaming ingestion for live monitoring and a web-based dashboard built with React to make the results accessible beyond the data team.</w:t>
       </w:r>
     </w:p>
     <w:p>

</xml_diff>

<commit_message>
Add Figure 4.6 Use Case Workflow diagram to report
</commit_message>
<xml_diff>
--- a/docs/Richard_Clay_Final_Report.docx
+++ b/docs/Richard_Clay_Final_Report.docx
@@ -382,6 +382,55 @@
         <w:t xml:space="preserve">Figure 4.5 — Use Case Diagram: System components and actor interactions</w:t>
         <w:rPr>
           <w:sz w:val="22"/>
+          <w:i/>
+          <w:sz w:val="18"/>
+          <w:color w:val="4A4A4A"/>
+        </w:rPr>
+      </w:r>
+    </w:p>
+    <w:p>
+      <w:pPr>
+        <w:jc w:val="center"/>
+      </w:pPr>
+      <w:r>
+        <w:drawing>
+          <wp:inline xmlns:a="http://schemas.openxmlformats.org/drawingml/2006/main" xmlns:pic="http://schemas.openxmlformats.org/drawingml/2006/picture">
+            <wp:extent cx="5029200" cy="2490458"/>
+            <wp:docPr id="13" name="Picture 13"/>
+            <wp:cNvGraphicFramePr>
+              <a:graphicFrameLocks noChangeAspect="1"/>
+            </wp:cNvGraphicFramePr>
+            <a:graphic>
+              <a:graphicData uri="http://schemas.openxmlformats.org/drawingml/2006/picture">
+                <pic:pic>
+                  <pic:nvPicPr>
+                    <pic:cNvPr id="0" name="use_case_workflow.png"/>
+                    <pic:cNvPicPr/>
+                  </pic:nvPicPr>
+                  <pic:blipFill>
+                    <a:blip r:embed="rId20"/>
+                    <a:stretch>
+                      <a:fillRect/>
+                    </a:stretch>
+                  </pic:blipFill>
+                  <pic:spPr>
+                    <a:xfrm>
+                      <a:off x="0" y="0"/>
+                      <a:ext cx="5029200" cy="2490458"/>
+                    </a:xfrm>
+                    <a:prstGeom prst="rect"/>
+                  </pic:spPr>
+                </pic:pic>
+              </a:graphicData>
+            </a:graphic>
+          </wp:inline>
+        </w:drawing>
+      </w:r>
+    </w:p>
+    <w:p>
+      <w:r>
+        <w:t xml:space="preserve">Figure 4.6 — Use Case Workflow: Data Analyst prepares insights, Decision Maker acts on findings</w:t>
+        <w:rPr>
           <w:i/>
           <w:sz w:val="18"/>
           <w:color w:val="4A4A4A"/>

</xml_diff>